<commit_message>
updating all files for Dryad
</commit_message>
<xml_diff>
--- a/TablesFigures/AIC_Experience_Threshold_Comparison.docx
+++ b/TablesFigures/AIC_Experience_Threshold_Comparison.docx
@@ -342,7 +342,7 @@
                 <w:szCs w:val="22"/>
                 <w:color w:val="000000"/>
               </w:rPr>
-              <w:t xml:space="preserve">2,742.5</w:t>
+              <w:t xml:space="preserve">2,595.4</w:t>
             </w:r>
           </w:p>
         </w:tc>
@@ -394,7 +394,7 @@
                 <w:szCs w:val="22"/>
                 <w:color w:val="000000"/>
               </w:rPr>
-              <w:t xml:space="preserve">11.10</w:t>
+              <w:t xml:space="preserve">18.84</w:t>
             </w:r>
           </w:p>
         </w:tc>
@@ -446,7 +446,7 @@
                 <w:szCs w:val="22"/>
                 <w:color w:val="000000"/>
               </w:rPr>
-              <w:t xml:space="preserve">0.002</w:t>
+              <w:t xml:space="preserve">0.000</w:t>
             </w:r>
           </w:p>
         </w:tc>
@@ -556,7 +556,7 @@
                 <w:szCs w:val="22"/>
                 <w:color w:val="000000"/>
               </w:rPr>
-              <w:t xml:space="preserve">2,741.5</w:t>
+              <w:t xml:space="preserve">2,593.0</w:t>
             </w:r>
           </w:p>
         </w:tc>
@@ -608,7 +608,7 @@
                 <w:szCs w:val="22"/>
                 <w:color w:val="000000"/>
               </w:rPr>
-              <w:t xml:space="preserve">10.13</w:t>
+              <w:t xml:space="preserve">16.39</w:t>
             </w:r>
           </w:p>
         </w:tc>
@@ -660,7 +660,7 @@
                 <w:szCs w:val="22"/>
                 <w:color w:val="000000"/>
               </w:rPr>
-              <w:t xml:space="preserve">0.004</w:t>
+              <w:t xml:space="preserve">0.000</w:t>
             </w:r>
           </w:p>
         </w:tc>
@@ -770,7 +770,7 @@
                 <w:szCs w:val="22"/>
                 <w:color w:val="000000"/>
               </w:rPr>
-              <w:t xml:space="preserve">2,740.0</w:t>
+              <w:t xml:space="preserve">2,590.0</w:t>
             </w:r>
           </w:p>
         </w:tc>
@@ -822,7 +822,7 @@
                 <w:szCs w:val="22"/>
                 <w:color w:val="000000"/>
               </w:rPr>
-              <w:t xml:space="preserve">8.67</w:t>
+              <w:t xml:space="preserve">13.41</w:t>
             </w:r>
           </w:p>
         </w:tc>
@@ -874,7 +874,7 @@
                 <w:szCs w:val="22"/>
                 <w:color w:val="000000"/>
               </w:rPr>
-              <w:t xml:space="preserve">0.007</w:t>
+              <w:t xml:space="preserve">0.001</w:t>
             </w:r>
           </w:p>
         </w:tc>
@@ -984,7 +984,7 @@
                 <w:szCs w:val="22"/>
                 <w:color w:val="000000"/>
               </w:rPr>
-              <w:t xml:space="preserve">2,732.2</w:t>
+              <w:t xml:space="preserve">2,579.4</w:t>
             </w:r>
           </w:p>
         </w:tc>
@@ -1036,7 +1036,7 @@
                 <w:szCs w:val="22"/>
                 <w:color w:val="000000"/>
               </w:rPr>
-              <w:t xml:space="preserve">0.81</w:t>
+              <w:t xml:space="preserve">2.84</w:t>
             </w:r>
           </w:p>
         </w:tc>
@@ -1088,7 +1088,7 @@
                 <w:szCs w:val="22"/>
                 <w:color w:val="000000"/>
               </w:rPr>
-              <w:t xml:space="preserve">0.376</w:t>
+              <w:t xml:space="preserve">0.171</w:t>
             </w:r>
           </w:p>
         </w:tc>
@@ -1198,7 +1198,7 @@
                 <w:szCs w:val="22"/>
                 <w:color w:val="000000"/>
               </w:rPr>
-              <w:t xml:space="preserve">2,731.4</w:t>
+              <w:t xml:space="preserve">2,576.6</w:t>
             </w:r>
           </w:p>
         </w:tc>
@@ -1302,7 +1302,7 @@
                 <w:szCs w:val="22"/>
                 <w:color w:val="000000"/>
               </w:rPr>
-              <w:t xml:space="preserve">0.563</w:t>
+              <w:t xml:space="preserve">0.708</w:t>
             </w:r>
           </w:p>
         </w:tc>
@@ -1412,7 +1412,7 @@
                 <w:szCs w:val="22"/>
                 <w:color w:val="000000"/>
               </w:rPr>
-              <w:t xml:space="preserve">2,736.3</w:t>
+              <w:t xml:space="preserve">2,580.1</w:t>
             </w:r>
           </w:p>
         </w:tc>
@@ -1464,7 +1464,7 @@
                 <w:szCs w:val="22"/>
                 <w:color w:val="000000"/>
               </w:rPr>
-              <w:t xml:space="preserve">4.96</w:t>
+              <w:t xml:space="preserve">3.56</w:t>
             </w:r>
           </w:p>
         </w:tc>
@@ -1516,7 +1516,7 @@
                 <w:szCs w:val="22"/>
                 <w:color w:val="000000"/>
               </w:rPr>
-              <w:t xml:space="preserve">0.047</w:t>
+              <w:t xml:space="preserve">0.120</w:t>
             </w:r>
           </w:p>
         </w:tc>
@@ -1626,7 +1626,7 @@
                 <w:szCs w:val="22"/>
                 <w:color w:val="000000"/>
               </w:rPr>
-              <w:t xml:space="preserve">2,746.7</w:t>
+              <w:t xml:space="preserve">2,592.1</w:t>
             </w:r>
           </w:p>
         </w:tc>
@@ -1678,7 +1678,7 @@
                 <w:szCs w:val="22"/>
                 <w:color w:val="000000"/>
               </w:rPr>
-              <w:t xml:space="preserve">15.33</w:t>
+              <w:t xml:space="preserve">15.56</w:t>
             </w:r>
           </w:p>
         </w:tc>
@@ -1840,7 +1840,7 @@
                 <w:szCs w:val="22"/>
                 <w:color w:val="000000"/>
               </w:rPr>
-              <w:t xml:space="preserve">2,746.9</w:t>
+              <w:t xml:space="preserve">2,592.2</w:t>
             </w:r>
           </w:p>
         </w:tc>
@@ -1892,7 +1892,7 @@
                 <w:szCs w:val="22"/>
                 <w:color w:val="000000"/>
               </w:rPr>
-              <w:t xml:space="preserve">15.52</w:t>
+              <w:t xml:space="preserve">15.63</w:t>
             </w:r>
           </w:p>
         </w:tc>
@@ -2054,7 +2054,7 @@
                 <w:szCs w:val="22"/>
                 <w:color w:val="000000"/>
               </w:rPr>
-              <w:t xml:space="preserve">2,747.5</w:t>
+              <w:t xml:space="preserve">2,594.0</w:t>
             </w:r>
           </w:p>
         </w:tc>
@@ -2106,7 +2106,7 @@
                 <w:szCs w:val="22"/>
                 <w:color w:val="000000"/>
               </w:rPr>
-              <w:t xml:space="preserve">16.11</w:t>
+              <w:t xml:space="preserve">17.42</w:t>
             </w:r>
           </w:p>
         </w:tc>
@@ -2268,7 +2268,7 @@
                 <w:szCs w:val="22"/>
                 <w:color w:val="000000"/>
               </w:rPr>
-              <w:t xml:space="preserve">2,750.2</w:t>
+              <w:t xml:space="preserve">2,597.9</w:t>
             </w:r>
           </w:p>
         </w:tc>
@@ -2320,7 +2320,7 @@
                 <w:szCs w:val="22"/>
                 <w:color w:val="000000"/>
               </w:rPr>
-              <w:t xml:space="preserve">18.86</w:t>
+              <w:t xml:space="preserve">21.29</w:t>
             </w:r>
           </w:p>
         </w:tc>
@@ -2482,7 +2482,7 @@
                 <w:szCs w:val="22"/>
                 <w:color w:val="000000"/>
               </w:rPr>
-              <w:t xml:space="preserve">2,751.7</w:t>
+              <w:t xml:space="preserve">2,600.8</w:t>
             </w:r>
           </w:p>
         </w:tc>
@@ -2534,7 +2534,7 @@
                 <w:szCs w:val="22"/>
                 <w:color w:val="000000"/>
               </w:rPr>
-              <w:t xml:space="preserve">20.38</w:t>
+              <w:t xml:space="preserve">24.23</w:t>
             </w:r>
           </w:p>
         </w:tc>

</xml_diff>